<commit_message>
fix(git): reinstall autosweep and close sync drift
</commit_message>
<xml_diff>
--- a/项目成员/团队名册_v1.9.docx
+++ b/项目成员/团队名册_v1.9.docx
@@ -16,57 +16,11 @@
         <w:ind w:left="567"/>
       </w:pPr>
       <w:r>
-        <w:rPr>
-          <w:rFonts w:ascii="Microsoft YaHei" w:hAnsi="Microsoft YaHei" w:eastAsia="Microsoft YaHei"/>
-          <w:b w:val="0"/>
-          <w:i/>
-          <w:color w:val="555555"/>
-          <w:sz w:val="21"/>
-        </w:rPr>
-        <w:t>版本 v1.9 | 2026-05-26 | 项目总监 阿黑</w:t>
+        <w:t>版本 v1.9 | 2026-06-12 | 项目总监 阿黑</w:t>
         <w:br/>
         <w:t>本文档纳入规则红线 §5.4 版本管理体系。版本号变更须同步更新 CHANGELOG 和文档版本索引。</w:t>
         <w:br/>
-      </w:r>
-      <w:r>
-        <w:rPr>
-          <w:rFonts w:ascii="Microsoft YaHei" w:hAnsi="Microsoft YaHei" w:eastAsia="Microsoft YaHei"/>
-          <w:b/>
-          <w:i/>
-          <w:color w:val="555555"/>
-          <w:sz w:val="21"/>
-        </w:rPr>
-        <w:t>双格式同步</w:t>
-      </w:r>
-      <w:r>
-        <w:rPr>
-          <w:rFonts w:ascii="Microsoft YaHei" w:hAnsi="Microsoft YaHei" w:eastAsia="Microsoft YaHei"/>
-          <w:b w:val="0"/>
-          <w:i/>
-          <w:color w:val="555555"/>
-          <w:sz w:val="21"/>
-        </w:rPr>
-        <w:t xml:space="preserve">：修改本 .md 文件后必须同步更新 </w:t>
-      </w:r>
-      <w:r>
-        <w:rPr>
-          <w:rFonts w:ascii="Consolas" w:hAnsi="Consolas" w:eastAsia="Consolas"/>
-          <w:b w:val="0"/>
-          <w:i/>
-          <w:color w:val="555555"/>
-          <w:sz w:val="18"/>
-        </w:rPr>
-        <w:t>团队名册.xlsx</w:t>
-      </w:r>
-      <w:r>
-        <w:rPr>
-          <w:rFonts w:ascii="Microsoft YaHei" w:hAnsi="Microsoft YaHei" w:eastAsia="Microsoft YaHei"/>
-          <w:b w:val="0"/>
-          <w:i/>
-          <w:color w:val="555555"/>
-          <w:sz w:val="21"/>
-        </w:rPr>
-        <w:t>（规则红线 §5.4.8.4）。</w:t>
+        <w:t>双格式同步：修改本 .md 文件后必须同步更新 团队名册.xlsx（规则红线 §5.4.8.4）。</w:t>
       </w:r>
     </w:p>
     <w:p>
@@ -296,14 +250,8 @@
             <w:pPr>
               <w:spacing w:before="20" w:after="20"/>
             </w:pPr>
-            <w:r/>
             <w:r>
-              <w:rPr>
-                <w:rFonts w:ascii="Microsoft YaHei" w:hAnsi="Microsoft YaHei" w:eastAsia="Microsoft YaHei"/>
-                <w:b w:val="0"/>
-                <w:sz w:val="21"/>
-              </w:rPr>
-              <w:t>用户 → 阿黑 → 腰子(金融负责人) ← 山猫/信鸽/玉夜/流金/青山</w:t>
+              <w:t>用户 → 阿黑 → 腰子(金融负责人) ← 山猫/信鸽/玉夜/流金/青山/砺石</w:t>
             </w:r>
           </w:p>
         </w:tc>
@@ -334,14 +282,8 @@
             <w:pPr>
               <w:spacing w:before="20" w:after="20"/>
             </w:pPr>
-            <w:r/>
             <w:r>
-              <w:rPr>
-                <w:rFonts w:ascii="Microsoft YaHei" w:hAnsi="Microsoft YaHei" w:eastAsia="Microsoft YaHei"/>
-                <w:b w:val="0"/>
-                <w:sz w:val="21"/>
-              </w:rPr>
-              <w:t>腰子 + 山猫 + 信鸽 + 玉夜 + 流金 + 青山</w:t>
+              <w:t>腰子 + 山猫 + 信鸽 + 玉夜 + 流金 + 青山 + 砺石</w:t>
             </w:r>
           </w:p>
         </w:tc>
@@ -529,7 +471,7 @@
         <w:pStyle w:val="Heading3"/>
       </w:pPr>
       <w:r>
-        <w:t>金融团队（6人）</w:t>
+        <w:t>金融团队（7人）</w:t>
       </w:r>
     </w:p>
     <w:tbl>
@@ -746,14 +688,8 @@
             <w:pPr>
               <w:spacing w:before="20" w:after="20"/>
             </w:pPr>
-            <w:r/>
             <w:r>
-              <w:rPr>
-                <w:rFonts w:ascii="Microsoft YaHei" w:hAnsi="Microsoft YaHei" w:eastAsia="Microsoft YaHei"/>
-                <w:b w:val="0"/>
-                <w:sz w:val="21"/>
-              </w:rPr>
-              <w:t>投资分析决策核心，协调五位专家，对金融判断质量负责</w:t>
+              <w:t>投资分析决策核心，协调六位专家，对金融判断质量负责</w:t>
             </w:r>
           </w:p>
         </w:tc>
@@ -1263,6 +1199,58 @@
                 <w:sz w:val="21"/>
               </w:rPr>
               <w:t>告诉腰子怎么让策略更聪明</w:t>
+            </w:r>
+          </w:p>
+        </w:tc>
+      </w:tr>
+      <w:tr>
+        <w:tc>
+          <w:tcPr>
+            <w:tcW w:type="dxa" w:w="1728"/>
+          </w:tcPr>
+          <w:p>
+            <w:r>
+              <w:t>方法校准官</w:t>
+            </w:r>
+          </w:p>
+        </w:tc>
+        <w:tc>
+          <w:tcPr>
+            <w:tcW w:type="dxa" w:w="1728"/>
+          </w:tcPr>
+          <w:p>
+            <w:r>
+              <w:t>砺石</w:t>
+            </w:r>
+          </w:p>
+        </w:tc>
+        <w:tc>
+          <w:tcPr>
+            <w:tcW w:type="dxa" w:w="1728"/>
+          </w:tcPr>
+          <w:p>
+            <w:r>
+              <w:t>/砺石（按需）</w:t>
+            </w:r>
+          </w:p>
+        </w:tc>
+        <w:tc>
+          <w:tcPr>
+            <w:tcW w:type="dxa" w:w="1728"/>
+          </w:tcPr>
+          <w:p>
+            <w:r>
+              <w:t>方法校准、反证审查、同源证据/因果混淆/结论强度检查 → 支撑腰子的推理链质量</w:t>
+            </w:r>
+          </w:p>
+        </w:tc>
+        <w:tc>
+          <w:tcPr>
+            <w:tcW w:type="dxa" w:w="1728"/>
+          </w:tcPr>
+          <w:p>
+            <w:r>
+              <w:t>告诉腰子这个结论站不站得住</w:t>
             </w:r>
           </w:p>
         </w:tc>
@@ -1918,6 +1906,58 @@
           </w:p>
         </w:tc>
       </w:tr>
+      <w:tr>
+        <w:tc>
+          <w:tcPr>
+            <w:tcW w:type="dxa" w:w="1728"/>
+          </w:tcPr>
+          <w:p>
+            <w:r>
+              <w:t>方法校准官</w:t>
+            </w:r>
+          </w:p>
+        </w:tc>
+        <w:tc>
+          <w:tcPr>
+            <w:tcW w:type="dxa" w:w="1728"/>
+          </w:tcPr>
+          <w:p>
+            <w:r>
+              <w:t>砺石</w:t>
+            </w:r>
+          </w:p>
+        </w:tc>
+        <w:tc>
+          <w:tcPr>
+            <w:tcW w:type="dxa" w:w="1728"/>
+          </w:tcPr>
+          <w:p>
+            <w:r>
+              <w:t>/砺石（按需）</w:t>
+            </w:r>
+          </w:p>
+        </w:tc>
+        <w:tc>
+          <w:tcPr>
+            <w:tcW w:type="dxa" w:w="1728"/>
+          </w:tcPr>
+          <w:p>
+            <w:r>
+              <w:t>方法校准、反证审查、同源证据/因果混淆/结论强度检查 → 支撑腰子的推理链质量</w:t>
+            </w:r>
+          </w:p>
+        </w:tc>
+        <w:tc>
+          <w:tcPr>
+            <w:tcW w:type="dxa" w:w="1728"/>
+          </w:tcPr>
+          <w:p>
+            <w:r>
+              <w:t>告诉腰子这个结论站不站得住</w:t>
+            </w:r>
+          </w:p>
+        </w:tc>
+      </w:tr>
     </w:tbl>
     <w:p>
       <w:pPr>
@@ -2177,6 +2217,58 @@
           </w:p>
         </w:tc>
       </w:tr>
+      <w:tr>
+        <w:tc>
+          <w:tcPr>
+            <w:tcW w:type="dxa" w:w="1728"/>
+          </w:tcPr>
+          <w:p>
+            <w:r>
+              <w:t>方法校准官</w:t>
+            </w:r>
+          </w:p>
+        </w:tc>
+        <w:tc>
+          <w:tcPr>
+            <w:tcW w:type="dxa" w:w="1728"/>
+          </w:tcPr>
+          <w:p>
+            <w:r>
+              <w:t>砺石</w:t>
+            </w:r>
+          </w:p>
+        </w:tc>
+        <w:tc>
+          <w:tcPr>
+            <w:tcW w:type="dxa" w:w="1728"/>
+          </w:tcPr>
+          <w:p>
+            <w:r>
+              <w:t>/砺石（按需）</w:t>
+            </w:r>
+          </w:p>
+        </w:tc>
+        <w:tc>
+          <w:tcPr>
+            <w:tcW w:type="dxa" w:w="1728"/>
+          </w:tcPr>
+          <w:p>
+            <w:r>
+              <w:t>方法校准、反证审查、同源证据/因果混淆/结论强度检查 → 支撑腰子的推理链质量</w:t>
+            </w:r>
+          </w:p>
+        </w:tc>
+        <w:tc>
+          <w:tcPr>
+            <w:tcW w:type="dxa" w:w="1728"/>
+          </w:tcPr>
+          <w:p>
+            <w:r>
+              <w:t>告诉腰子这个结论站不站得住</w:t>
+            </w:r>
+          </w:p>
+        </w:tc>
+      </w:tr>
     </w:tbl>
     <w:p>
       <w:pPr>
@@ -2302,7 +2394,7 @@
           <w:b w:val="0"/>
           <w:sz w:val="21"/>
         </w:rPr>
-        <w:t>：对投资分析的质量和结果负责，协调四位专家完成分析任务</w:t>
+        <w:t>：对投资分析的质量和结果负责，协调六位支撑角色完成分析任务</w:t>
       </w:r>
     </w:p>
     <w:p>
@@ -3616,7 +3708,7 @@
         <w:pStyle w:val="Heading3"/>
       </w:pPr>
       <w:r>
-        <w:t>金融链路（腰子为核心，四位专家支撑）</w:t>
+        <w:t>金融链路（腰子为核心，六位支撑角色支撑）</w:t>
       </w:r>
     </w:p>
     <w:p>
@@ -3651,22 +3743,7 @@
         <w:spacing w:after="80"/>
       </w:pPr>
       <w:r>
-        <w:rPr>
-          <w:rFonts w:ascii="Microsoft YaHei" w:hAnsi="Microsoft YaHei" w:eastAsia="Microsoft YaHei"/>
-          <w:b/>
-          <w:i w:val="0"/>
-          <w:sz w:val="21"/>
-        </w:rPr>
-        <w:t>信息流</w:t>
-      </w:r>
-      <w:r>
-        <w:rPr>
-          <w:rFonts w:ascii="Microsoft YaHei" w:hAnsi="Microsoft YaHei" w:eastAsia="Microsoft YaHei"/>
-          <w:b w:val="0"/>
-          <w:i w:val="0"/>
-          <w:sz w:val="21"/>
-        </w:rPr>
-        <w:t>：山猫+信鸽+玉夜+流金+青山 → 腰子 → 投资决策。腰子不做所有事，但为所有金融判断负责。</w:t>
+        <w:t>信息流：山猫+信鸽+玉夜+流金+青山+砺石（按需） → 腰子 → 投资决策。腰子不做所有事，但为所有金融判断负责。</w:t>
       </w:r>
     </w:p>
     <w:p>
@@ -5619,46 +5696,58 @@
         <w:ind w:left="567"/>
       </w:pPr>
       <w:r>
-        <w:rPr>
-          <w:rFonts w:ascii="Microsoft YaHei" w:hAnsi="Microsoft YaHei" w:eastAsia="Microsoft YaHei"/>
-          <w:b/>
-          <w:i/>
-          <w:color w:val="555555"/>
-          <w:sz w:val="21"/>
-        </w:rPr>
-        <w:t>阿黑</w:t>
-      </w:r>
-      <w:r>
-        <w:rPr>
-          <w:rFonts w:ascii="Microsoft YaHei" w:hAnsi="Microsoft YaHei" w:eastAsia="Microsoft YaHei"/>
-          <w:b w:val="0"/>
-          <w:i/>
-          <w:color w:val="555555"/>
-          <w:sz w:val="21"/>
-        </w:rPr>
-        <w:t>：十三人团队，三线作战。金融线由腰子全权负责（山猫+信鸽+玉夜+流金+青山做专业支撑），工程线（情墨→红结→千光→新安→红枫形成设计→编码→CI→测试→部署闭环）做系统建设，审计线（旧影独立审计）确保项目不跑偏、红线不松动、成本不浪费。</w:t>
+        <w:t>阿黑：十四人团队，三线作战。金融线由腰子全权负责（山猫+信鸽+玉夜+流金+青山做专业支撑），工程线（情墨→红结→千光→新安→红枫形成设计→编码→CI→测试→部署闭环）做系统建设，审计线（旧影独立审计）确保项目不跑偏、红线不松动、成本不浪费。</w:t>
         <w:br/>
         <w:br/>
+        <w:t>知识体系状态 (2026-05-26)：全13个专业角色已完成知识库固化（共64个知识文件，~900KB）。金融七角色(腰子/流金/青山/山猫/玉夜/信鸽) + 工程五角色(情墨/千光/红枫/新安/红结) + 审计官(旧影)。信鸽 v1.0 为本版本新增角色。</w:t>
       </w:r>
+    </w:p>
+    <w:p>
+      <w:pPr>
+        <w:pStyle w:val="Heading3"/>
+      </w:pPr>
       <w:r>
-        <w:rPr>
-          <w:rFonts w:ascii="Microsoft YaHei" w:hAnsi="Microsoft YaHei" w:eastAsia="Microsoft YaHei"/>
-          <w:b/>
-          <w:i/>
-          <w:color w:val="555555"/>
-          <w:sz w:val="21"/>
-        </w:rPr>
-        <w:t>知识体系状态 (2026-05-26)</w:t>
+        <w:t>砺石 — 方法校准官</w:t>
       </w:r>
+    </w:p>
+    <w:p>
       <w:r>
-        <w:rPr>
-          <w:rFonts w:ascii="Microsoft YaHei" w:hAnsi="Microsoft YaHei" w:eastAsia="Microsoft YaHei"/>
-          <w:b w:val="0"/>
-          <w:i/>
-          <w:color w:val="555555"/>
-          <w:sz w:val="21"/>
-        </w:rPr>
-        <w:t>：全12个专业角色已完成知识库固化（共64个知识文件，~900KB）。金融六角色(腰子/流金/青山/山猫/玉夜/信鸽) + 工程五角色(情墨/千光/红枫/新安/红结) + 审计官(旧影)。信鸽 v1.0 为本版本新增角色。</w:t>
+        <w:t>方法校准与反证审查，给腰子提供推理链质量参考。</w:t>
+      </w:r>
+    </w:p>
+    <w:p>
+      <w:r>
+        <w:t>检查同源证据重复、因果混淆、结论强度过高、隐含假设未说明、反证不足。</w:t>
+      </w:r>
+    </w:p>
+    <w:p>
+      <w:r>
+        <w:t>按需唤醒；不作为 F-ANALYSIS 必唤醒角色。</w:t>
+      </w:r>
+    </w:p>
+    <w:p>
+      <w:r>
+        <w:t>完整人设：.claude/agents/方法校准官-砺石.md</w:t>
+      </w:r>
+    </w:p>
+    <w:p>
+      <w:r>
+        <w:t>召唤命令：.claude/commands/砺石.md</w:t>
+      </w:r>
+    </w:p>
+    <w:p>
+      <w:r>
+        <w:t>方法审查包：统一解读/角色解释包/砺石_方法审查包.md</w:t>
+      </w:r>
+    </w:p>
+    <w:p>
+      <w:r>
+        <w:t>不做投资方向判断，不替代腰子裁决；腰子驳回砺石意见时需记录理由。</w:t>
+      </w:r>
+    </w:p>
+    <w:p>
+      <w:r>
+        <w:t>知识库状态：已进入知识库进化入口与追踪体系；LISHI-SEED 规则为 L5-seed，尚未完成 15 步验证，不得宣称 L2 或 active rule。</w:t>
       </w:r>
     </w:p>
     <w:sectPr>

</xml_diff>